<commit_message>
updated additional files for submission
</commit_message>
<xml_diff>
--- a/JCOMP_submission/highlights.docx
+++ b/JCOMP_submission/highlights.docx
@@ -42,25 +42,13 @@
         <w:rPr>
           <w:sz w:val="22"/>
         </w:rPr>
-        <w:t xml:space="preserve">a </w:t>
+        <w:t>a new</w:t>
       </w:r>
       <w:r>
         <w:rPr>
           <w:sz w:val="22"/>
         </w:rPr>
-        <w:t xml:space="preserve">novel iterative solver strategy for </w:t>
-      </w:r>
-      <w:r>
-        <w:rPr>
-          <w:sz w:val="22"/>
-        </w:rPr>
-        <w:t xml:space="preserve">fully </w:t>
-      </w:r>
-      <w:r>
-        <w:rPr>
-          <w:sz w:val="22"/>
-        </w:rPr>
-        <w:t>implicit Runge-Kutta schemes</w:t>
+        <w:t xml:space="preserve"> iterative solver strategy for fully implicit RK schemes for RSWE</w:t>
       </w:r>
     </w:p>
     <w:p>
@@ -104,49 +92,7 @@
         <w:rPr>
           <w:sz w:val="22"/>
         </w:rPr>
-        <w:t>I</w:t>
-      </w:r>
-      <w:r>
-        <w:rPr>
-          <w:sz w:val="22"/>
-        </w:rPr>
-        <w:t xml:space="preserve">mplicit schemes, </w:t>
-      </w:r>
-      <w:r>
-        <w:rPr>
-          <w:sz w:val="22"/>
-        </w:rPr>
-        <w:t>in contrast,</w:t>
-      </w:r>
-      <w:r>
-        <w:rPr>
-          <w:sz w:val="22"/>
-        </w:rPr>
-        <w:t xml:space="preserve"> </w:t>
-      </w:r>
-      <w:r>
-        <w:rPr>
-          <w:sz w:val="22"/>
-        </w:rPr>
-        <w:t>c</w:t>
-      </w:r>
-      <w:r>
-        <w:rPr>
-          <w:sz w:val="22"/>
-        </w:rPr>
-        <w:t xml:space="preserve">an be energy conserving while avoiding </w:t>
-      </w:r>
-      <w:r>
-        <w:rPr>
-          <w:sz w:val="22"/>
-        </w:rPr>
-        <w:t xml:space="preserve">splitting </w:t>
-      </w:r>
-      <w:r>
-        <w:rPr>
-          <w:sz w:val="22"/>
-        </w:rPr>
-        <w:t>errors</w:t>
+        <w:t>Implicit schemes, in contrast, can be energy conserving while avoiding splitting errors</w:t>
       </w:r>
     </w:p>
     <w:p>
@@ -168,61 +114,7 @@
         <w:rPr>
           <w:sz w:val="22"/>
         </w:rPr>
-        <w:t>O</w:t>
-      </w:r>
-      <w:r>
-        <w:rPr>
-          <w:sz w:val="22"/>
-        </w:rPr>
-        <w:t xml:space="preserve">ur </w:t>
-      </w:r>
-      <w:r>
-        <w:rPr>
-          <w:sz w:val="22"/>
-        </w:rPr>
-        <w:t>approach</w:t>
-      </w:r>
-      <w:r>
-        <w:rPr>
-          <w:sz w:val="22"/>
-        </w:rPr>
-        <w:t xml:space="preserve"> is close to </w:t>
-      </w:r>
-      <w:r>
-        <w:rPr>
-          <w:sz w:val="22"/>
-        </w:rPr>
-        <w:t>a benchmark</w:t>
-      </w:r>
-      <w:r>
-        <w:rPr>
-          <w:sz w:val="22"/>
-        </w:rPr>
-        <w:t xml:space="preserve"> </w:t>
-      </w:r>
-      <w:r>
-        <w:rPr>
-          <w:sz w:val="22"/>
-        </w:rPr>
-        <w:t xml:space="preserve">splitting (IMEX) </w:t>
-      </w:r>
-      <w:r>
-        <w:rPr>
-          <w:sz w:val="22"/>
-        </w:rPr>
-        <w:t>scheme</w:t>
-      </w:r>
-      <w:r>
-        <w:rPr>
-          <w:sz w:val="22"/>
-        </w:rPr>
-        <w:t xml:space="preserve"> </w:t>
-      </w:r>
-      <w:r>
-        <w:rPr>
-          <w:sz w:val="22"/>
-        </w:rPr>
-        <w:t>for comparable accuracy</w:t>
+        <w:t>Our approach is close to a benchmark splitting (IMEX) scheme for comparable accuracy</w:t>
       </w:r>
     </w:p>
     <w:p>
@@ -244,13 +136,7 @@
         <w:rPr>
           <w:sz w:val="22"/>
         </w:rPr>
-        <w:t xml:space="preserve">However, it </w:t>
-      </w:r>
-      <w:r>
-        <w:rPr>
-          <w:sz w:val="22"/>
-        </w:rPr>
-        <w:t>can provide faster wallclock times if less accuracy is needed</w:t>
+        <w:t>However, it can provide faster wallclock times if less accuracy is needed</w:t>
       </w:r>
     </w:p>
     <w:sectPr>
@@ -934,6 +820,7 @@
     <w:rsid w:val="007a3f98"/>
     <w:pPr>
       <w:widowControl/>
+      <w:suppressAutoHyphens w:val="true"/>
       <w:bidi w:val="0"/>
       <w:spacing w:before="0" w:after="200"/>
       <w:jc w:val="left"/>
@@ -1338,7 +1225,6 @@
   </w:style>
   <w:style w:type="character" w:styleId="FootnoteCharacters">
     <w:name w:val="Footnote Characters"/>
-    <w:basedOn w:val="DefaultParagraphFont"/>
     <w:qFormat/>
     <w:rsid w:val="007a3f98"/>
     <w:rPr>
@@ -1796,6 +1682,7 @@
       <w:keepNext w:val="true"/>
       <w:keepLines/>
       <w:widowControl/>
+      <w:suppressAutoHyphens w:val="true"/>
       <w:bidi w:val="0"/>
       <w:spacing w:before="0" w:after="200"/>
       <w:jc w:val="center"/>
@@ -1819,6 +1706,7 @@
       <w:keepNext w:val="true"/>
       <w:keepLines/>
       <w:widowControl/>
+      <w:suppressAutoHyphens w:val="true"/>
       <w:bidi w:val="0"/>
       <w:spacing w:before="0" w:after="200"/>
       <w:jc w:val="center"/>
@@ -1914,7 +1802,7 @@
     </w:pPr>
     <w:rPr>
       <w:iCs w:val="false"/>
-      <w:color w:val="auto"/>
+      <w:color w:themeColor="text2" w:val="auto"/>
       <w:sz w:val="24"/>
       <w:szCs w:val="24"/>
     </w:rPr>
@@ -1930,7 +1818,7 @@
     </w:pPr>
     <w:rPr>
       <w:iCs w:val="false"/>
-      <w:color w:val="auto"/>
+      <w:color w:themeColor="text2" w:val="auto"/>
       <w:sz w:val="24"/>
       <w:szCs w:val="24"/>
     </w:rPr>

</xml_diff>